<commit_message>
Corrige sobreposição no PDF e atualiza instruções de imagem — Agosto 2026
- PDF refeito com Table-based layout (reportlab) para eliminar sobreposição de texto
- DOCX reescrito com encoding correto (sem corrupção de acentos)
- Instruções de imagem atualizadas: foto de equipe na capa do carrossel 05/08, slides 2-8 somente texto, prompts IA em português, foto real de terapeuta no post 12/08, foto real do espaço/terapeuta na capa do carrossel 19/08

Co-Authored-By: Claude Sonnet 4.6 <noreply@anthropic.com>
</commit_message>
<xml_diff>
--- a/refugio-dos-4-elementos/calendario-editorial-agosto-2026.docx
+++ b/refugio-dos-4-elementos/calendario-editorial-agosto-2026.docx
@@ -139,7 +139,7 @@
           <w:color w:val="3B2E2A"/>
           <w:sz w:val="18"/>
         </w:rPr>
-        <w:t xml:space="preserve">  Slide 1 de 8 — Foto real da Daniela</w:t>
+        <w:t xml:space="preserve">  Slide 1 de 8 — Foto da equipe</w:t>
       </w:r>
     </w:p>
     <w:p>
@@ -168,7 +168,7 @@
           <w:rFonts w:ascii="Calibri" w:hAnsi="Calibri"/>
           <w:b w:val="0"/>
           <w:i/>
-          <w:color w:val="666666"/>
+          <w:color w:val="555555"/>
           <w:sz w:val="20"/>
         </w:rPr>
         <w:t>Subgancho: E como o Refúgio dos 4 Elementos pode ser o começo dessa mudança</w:t>
@@ -197,7 +197,7 @@
           <w:color w:val="3B2E2A"/>
           <w:sz w:val="18"/>
         </w:rPr>
-        <w:t>Foto real da Daniela Sampaio. Fundo lilás #8B6FA8, headline em creme #F7F3EC, logo no canto.</w:t>
+        <w:t>Foto da equipe do Refúgio. Fundo lilás #8B6FA8, headline em creme #F7F3EC, logo no canto.</w:t>
       </w:r>
     </w:p>
     <w:p>
@@ -223,28 +223,28 @@
           <w:color w:val="3B2E2A"/>
           <w:sz w:val="18"/>
         </w:rPr>
-        <w:t xml:space="preserve">  Quem somos — Foto real da Daniela</w:t>
+        <w:t xml:space="preserve">  Quem somos — Somente texto</w:t>
       </w:r>
     </w:p>
     <w:p>
       <w:pPr>
-        <w:spacing w:before="60" w:after="120"/>
+        <w:spacing w:before="0" w:after="100"/>
         <w:jc w:val="left"/>
       </w:pPr>
       <w:r>
         <w:rPr>
           <w:rFonts w:ascii="Calibri" w:hAnsi="Calibri"/>
-          <w:b/>
+          <w:b w:val="0"/>
           <w:i w:val="0"/>
           <w:color w:val="3B2E2A"/>
-          <w:sz w:val="24"/>
+          <w:sz w:val="22"/>
         </w:rPr>
         <w:t>3 anos cuidando de quem chegou no limite</w:t>
       </w:r>
     </w:p>
     <w:p>
       <w:pPr>
-        <w:spacing w:before="0" w:after="120"/>
+        <w:spacing w:before="0" w:after="100"/>
         <w:jc w:val="left"/>
       </w:pPr>
       <w:r>
@@ -252,6 +252,7 @@
           <w:rFonts w:ascii="Calibri" w:hAnsi="Calibri"/>
           <w:b w:val="0"/>
           <w:i w:val="0"/>
+          <w:color w:val="3B2E2A"/>
           <w:sz w:val="22"/>
         </w:rPr>
         <w:t>O Refúgio dos 4 Elementos é um espaço terapêutico holístico com sede em Cuiabá e atendimento online para todo o Brasil. Guiado por terapeutas que trabalham o ser humano de forma integral: corpo, mente, emoções e espírito, através dos 4 elementos: Terra, Água, Fogo e Ar.</w:t>
@@ -259,7 +260,7 @@
     </w:p>
     <w:p>
       <w:pPr>
-        <w:spacing w:before="0" w:after="120"/>
+        <w:spacing w:before="40" w:after="80"/>
         <w:jc w:val="left"/>
       </w:pPr>
       <w:r>
@@ -271,32 +272,6 @@
           <w:sz w:val="20"/>
         </w:rPr>
         <w:t>E como saber se você está no momento certo de conhecer e se curar através de alguma terapia holística?</w:t>
-      </w:r>
-    </w:p>
-    <w:p>
-      <w:pPr>
-        <w:spacing w:before="60" w:after="160"/>
-        <w:shd w:val="clear" w:color="auto" w:fill="FBF1EB"/>
-      </w:pPr>
-      <w:r>
-        <w:rPr>
-          <w:rFonts w:ascii="Calibri" w:hAnsi="Calibri"/>
-          <w:b/>
-          <w:i w:val="0"/>
-          <w:color w:val="C97B4A"/>
-          <w:sz w:val="16"/>
-        </w:rPr>
-        <w:t xml:space="preserve">IMAGEM: </w:t>
-      </w:r>
-      <w:r>
-        <w:rPr>
-          <w:rFonts w:ascii="Calibri" w:hAnsi="Calibri"/>
-          <w:b w:val="0"/>
-          <w:i/>
-          <w:color w:val="3B2E2A"/>
-          <w:sz w:val="18"/>
-        </w:rPr>
-        <w:t>Foto real da Daniela Sampaio.</w:t>
       </w:r>
     </w:p>
     <w:p>
@@ -327,14 +302,15 @@
     </w:p>
     <w:p>
       <w:pPr>
-        <w:spacing w:before="0" w:after="120"/>
+        <w:spacing w:before="0" w:after="100"/>
         <w:jc w:val="left"/>
       </w:pPr>
       <w:r>
         <w:rPr>
           <w:rFonts w:ascii="Calibri" w:hAnsi="Calibri"/>
-          <w:b/>
+          <w:b w:val="0"/>
           <w:i w:val="0"/>
+          <w:color w:val="3B2E2A"/>
           <w:sz w:val="22"/>
         </w:rPr>
         <w:t>Você reconhece algum destes sinais?</w:t>
@@ -486,7 +462,7 @@
     </w:p>
     <w:p>
       <w:pPr>
-        <w:spacing w:before="0" w:after="80"/>
+        <w:spacing w:before="40" w:after="80"/>
         <w:jc w:val="left"/>
       </w:pPr>
       <w:r>
@@ -494,6 +470,7 @@
           <w:rFonts w:ascii="Calibri" w:hAnsi="Calibri"/>
           <w:b w:val="0"/>
           <w:i/>
+          <w:color w:val="555555"/>
           <w:sz w:val="20"/>
         </w:rPr>
         <w:t>Se você se viu em uma das opções acima, então esse pode ser um sinal...</w:t>
@@ -527,14 +504,15 @@
     </w:p>
     <w:p>
       <w:pPr>
-        <w:spacing w:before="0" w:after="120"/>
+        <w:spacing w:before="0" w:after="100"/>
         <w:jc w:val="left"/>
       </w:pPr>
       <w:r>
         <w:rPr>
           <w:rFonts w:ascii="Calibri" w:hAnsi="Calibri"/>
-          <w:b/>
+          <w:b w:val="0"/>
           <w:i w:val="0"/>
+          <w:color w:val="3B2E2A"/>
           <w:sz w:val="22"/>
         </w:rPr>
         <w:t>Conheça as opções de Terapias Holísticas que podemos te oferecer:</w:t>
@@ -542,15 +520,15 @@
     </w:p>
     <w:p>
       <w:pPr>
-        <w:spacing w:before="0" w:after="120"/>
+        <w:spacing w:before="0" w:after="100"/>
         <w:jc w:val="left"/>
       </w:pPr>
       <w:r>
         <w:rPr>
           <w:rFonts w:ascii="Calibri" w:hAnsi="Calibri"/>
-          <w:b/>
+          <w:b w:val="0"/>
           <w:i w:val="0"/>
-          <w:color w:val="8B6FA8"/>
+          <w:color w:val="3B2E2A"/>
           <w:sz w:val="22"/>
         </w:rPr>
         <w:t>Constelação Familiar</w:t>
@@ -558,7 +536,7 @@
     </w:p>
     <w:p>
       <w:pPr>
-        <w:spacing w:before="0" w:after="120"/>
+        <w:spacing w:before="0" w:after="100"/>
         <w:jc w:val="left"/>
       </w:pPr>
       <w:r>
@@ -566,6 +544,7 @@
           <w:rFonts w:ascii="Calibri" w:hAnsi="Calibri"/>
           <w:b w:val="0"/>
           <w:i w:val="0"/>
+          <w:color w:val="3B2E2A"/>
           <w:sz w:val="22"/>
         </w:rPr>
         <w:t>Para quem repete os mesmos padrões em relacionamentos, carrega conflitos de família ou sente que algo vem de muito antes de você.</w:t>
@@ -599,15 +578,15 @@
     </w:p>
     <w:p>
       <w:pPr>
-        <w:spacing w:before="0" w:after="120"/>
+        <w:spacing w:before="0" w:after="100"/>
         <w:jc w:val="left"/>
       </w:pPr>
       <w:r>
         <w:rPr>
           <w:rFonts w:ascii="Calibri" w:hAnsi="Calibri"/>
-          <w:b/>
+          <w:b w:val="0"/>
           <w:i w:val="0"/>
-          <w:color w:val="8B6FA8"/>
+          <w:color w:val="3B2E2A"/>
           <w:sz w:val="22"/>
         </w:rPr>
         <w:t>Reiki e Passe Energético</w:t>
@@ -615,7 +594,7 @@
     </w:p>
     <w:p>
       <w:pPr>
-        <w:spacing w:before="0" w:after="120"/>
+        <w:spacing w:before="0" w:after="100"/>
         <w:jc w:val="left"/>
       </w:pPr>
       <w:r>
@@ -623,6 +602,7 @@
           <w:rFonts w:ascii="Calibri" w:hAnsi="Calibri"/>
           <w:b w:val="0"/>
           <w:i w:val="0"/>
+          <w:color w:val="3B2E2A"/>
           <w:sz w:val="22"/>
         </w:rPr>
         <w:t>Para quem sente ansiedade, cansaço energético e precisa de equilíbrio entre o que sente e o que vive.</w:t>
@@ -656,15 +636,15 @@
     </w:p>
     <w:p>
       <w:pPr>
-        <w:spacing w:before="0" w:after="120"/>
+        <w:spacing w:before="0" w:after="100"/>
         <w:jc w:val="left"/>
       </w:pPr>
       <w:r>
         <w:rPr>
           <w:rFonts w:ascii="Calibri" w:hAnsi="Calibri"/>
-          <w:b/>
+          <w:b w:val="0"/>
           <w:i w:val="0"/>
-          <w:color w:val="8B6FA8"/>
+          <w:color w:val="3B2E2A"/>
           <w:sz w:val="22"/>
         </w:rPr>
         <w:t>Terapia Xamânica dos 4 Elementos</w:t>
@@ -672,7 +652,7 @@
     </w:p>
     <w:p>
       <w:pPr>
-        <w:spacing w:before="0" w:after="120"/>
+        <w:spacing w:before="0" w:after="100"/>
         <w:jc w:val="left"/>
       </w:pPr>
       <w:r>
@@ -680,6 +660,7 @@
           <w:rFonts w:ascii="Calibri" w:hAnsi="Calibri"/>
           <w:b w:val="0"/>
           <w:i w:val="0"/>
+          <w:color w:val="3B2E2A"/>
           <w:sz w:val="22"/>
         </w:rPr>
         <w:t>Para quem busca reconexão consigo, propósito e autoconhecimento profundo.</w:t>
@@ -713,15 +694,15 @@
     </w:p>
     <w:p>
       <w:pPr>
-        <w:spacing w:before="0" w:after="120"/>
+        <w:spacing w:before="0" w:after="100"/>
         <w:jc w:val="left"/>
       </w:pPr>
       <w:r>
         <w:rPr>
           <w:rFonts w:ascii="Calibri" w:hAnsi="Calibri"/>
-          <w:b/>
+          <w:b w:val="0"/>
           <w:i w:val="0"/>
-          <w:color w:val="8B6FA8"/>
+          <w:color w:val="3B2E2A"/>
           <w:sz w:val="22"/>
         </w:rPr>
         <w:t>Cristaloterapia, Aromaterapia, Cone Hindu, Conversa Fraterna e Imersão na Cachoeira</w:t>
@@ -729,7 +710,7 @@
     </w:p>
     <w:p>
       <w:pPr>
-        <w:spacing w:before="0" w:after="120"/>
+        <w:spacing w:before="0" w:after="100"/>
         <w:jc w:val="left"/>
       </w:pPr>
       <w:r>
@@ -737,6 +718,7 @@
           <w:rFonts w:ascii="Calibri" w:hAnsi="Calibri"/>
           <w:b w:val="0"/>
           <w:i w:val="0"/>
+          <w:color w:val="3B2E2A"/>
           <w:sz w:val="22"/>
         </w:rPr>
         <w:t>Para quem precisa de leveza, limpeza energética, escuta real e reconexão com a natureza.</w:t>
@@ -765,19 +747,20 @@
           <w:color w:val="3B2E2A"/>
           <w:sz w:val="18"/>
         </w:rPr>
-        <w:t xml:space="preserve">  CTA — Foto real do espaço ou da Daniela</w:t>
+        <w:t xml:space="preserve">  CTA — Somente texto</w:t>
       </w:r>
     </w:p>
     <w:p>
       <w:pPr>
-        <w:spacing w:before="0" w:after="120"/>
+        <w:spacing w:before="0" w:after="100"/>
         <w:jc w:val="left"/>
       </w:pPr>
       <w:r>
         <w:rPr>
           <w:rFonts w:ascii="Calibri" w:hAnsi="Calibri"/>
-          <w:b/>
+          <w:b w:val="0"/>
           <w:i w:val="0"/>
+          <w:color w:val="3B2E2A"/>
           <w:sz w:val="22"/>
         </w:rPr>
         <w:t>Sentiu que é o momento de dar o próximo passo e melhorar a sua vida através das terapias holísticas?</w:t>
@@ -797,32 +780,6 @@
           <w:sz w:val="22"/>
         </w:rPr>
         <w:t>Comenta REFÚGIO e vamos te mandar no seu direct tudo o que você precisa para dar o primeiro passo.</w:t>
-      </w:r>
-    </w:p>
-    <w:p>
-      <w:pPr>
-        <w:spacing w:before="60" w:after="160"/>
-        <w:shd w:val="clear" w:color="auto" w:fill="FBF1EB"/>
-      </w:pPr>
-      <w:r>
-        <w:rPr>
-          <w:rFonts w:ascii="Calibri" w:hAnsi="Calibri"/>
-          <w:b/>
-          <w:i w:val="0"/>
-          <w:color w:val="C97B4A"/>
-          <w:sz w:val="16"/>
-        </w:rPr>
-        <w:t xml:space="preserve">IMAGEM: </w:t>
-      </w:r>
-      <w:r>
-        <w:rPr>
-          <w:rFonts w:ascii="Calibri" w:hAnsi="Calibri"/>
-          <w:b w:val="0"/>
-          <w:i/>
-          <w:color w:val="3B2E2A"/>
-          <w:sz w:val="18"/>
-        </w:rPr>
-        <w:t>Foto real do espaço ou da Daniela em atendimento.</w:t>
       </w:r>
     </w:p>
     <w:p>
@@ -1219,7 +1176,7 @@
           <w:color w:val="3B2E2A"/>
           <w:sz w:val="18"/>
         </w:rPr>
-        <w:t>Prompt IA: A contemplative woman sitting alone in a warm, softly lit room, looking at old family photographs on a wooden table. Earthy tones: lilac, sage green, terracotta, cream. Photorealistic, square 1:1 format.</w:t>
+        <w:t>Prompt IA (em português): Mulher contemplativa sentada sozinha em um quarto aconchegante com luz suave, olhando para fotografias antigas de família sobre uma mesa de madeira. Tons terrosos: lilás, verde sálvia, terracota, creme. Fotorrealista, formato quadrado 1:1.</w:t>
       </w:r>
     </w:p>
     <w:p>
@@ -1594,7 +1551,7 @@
           <w:color w:val="3B2E2A"/>
           <w:sz w:val="18"/>
         </w:rPr>
-        <w:t>Priorizar foto real da Daniela em atendimento de Reiki. Alternativa — Prompt IA: A healing therapy session, therapist's hands hovering over a person on a massage table, soft golden light, earthy tones cream/lilac/sage, no faces visible, photorealistic 1:1.</w:t>
+        <w:t>Foto real: qualquer terapeuta do Refúgio aplicando Reiki.</w:t>
       </w:r>
     </w:p>
     <w:p>
@@ -1969,7 +1926,7 @@
           <w:color w:val="3B2E2A"/>
           <w:sz w:val="18"/>
         </w:rPr>
-        <w:t>Prompt IA (imagem de paciente): A woman sitting in a peaceful therapy space, eyes gently closed, expression of deep realization and relief. Soft natural light. Earthy tones: lilac, cream, terracotta, sage green. Photorealistic, cinematic, square 1:1 format.</w:t>
+        <w:t>Prompt IA (em português): Mulher sentada em um espaço terapêutico tranquilo, olhos suavemente fechados, expressão de profunda percepção e alívio. Luz natural suave. Tons terrosos: lilás, creme, terracota, verde sálvia. Fotorrealista, cinemático, formato quadrado 1:1.</w:t>
       </w:r>
     </w:p>
     <w:p>
@@ -2292,7 +2249,7 @@
           <w:color w:val="3B2E2A"/>
           <w:sz w:val="18"/>
         </w:rPr>
-        <w:t xml:space="preserve">  Slide 1 de 8 — Foto real da Daniela ou do espaço</w:t>
+        <w:t xml:space="preserve">  Slide 1 de 8 — Foto real de um terapeuta ou do espaço</w:t>
       </w:r>
     </w:p>
     <w:p>
@@ -2334,7 +2291,7 @@
           <w:color w:val="3B2E2A"/>
           <w:sz w:val="18"/>
         </w:rPr>
-        <w:t>Foto real da Daniela ou do espaço de atendimento. Fundo escuro (marrom ou lilás), headline em creme.</w:t>
+        <w:t>Foto real de um terapeuta ou do espaço de atendimento. Fundo escuro (marrom ou lilás), headline em creme.</w:t>
       </w:r>
     </w:p>
     <w:p>
@@ -2365,14 +2322,15 @@
     </w:p>
     <w:p>
       <w:pPr>
-        <w:spacing w:before="0" w:after="120"/>
+        <w:spacing w:before="0" w:after="100"/>
         <w:jc w:val="left"/>
       </w:pPr>
       <w:r>
         <w:rPr>
           <w:rFonts w:ascii="Calibri" w:hAnsi="Calibri"/>
-          <w:b/>
+          <w:b w:val="0"/>
           <w:i w:val="0"/>
+          <w:color w:val="3B2E2A"/>
           <w:sz w:val="22"/>
         </w:rPr>
         <w:t>Você vai de terapia em terapia e sente que algo não fecha?</w:t>
@@ -2380,7 +2338,7 @@
     </w:p>
     <w:p>
       <w:pPr>
-        <w:spacing w:before="0" w:after="120"/>
+        <w:spacing w:before="0" w:after="100"/>
         <w:jc w:val="left"/>
       </w:pPr>
       <w:r>
@@ -2388,6 +2346,7 @@
           <w:rFonts w:ascii="Calibri" w:hAnsi="Calibri"/>
           <w:b w:val="0"/>
           <w:i w:val="0"/>
+          <w:color w:val="3B2E2A"/>
           <w:sz w:val="22"/>
         </w:rPr>
         <w:t>A Constelação Familiar trabalha nas raízes, não nos sintomas. Por isso ela alcança o que outros métodos não chegam.</w:t>
@@ -2421,14 +2380,15 @@
     </w:p>
     <w:p>
       <w:pPr>
-        <w:spacing w:before="0" w:after="120"/>
+        <w:spacing w:before="0" w:after="100"/>
         <w:jc w:val="left"/>
       </w:pPr>
       <w:r>
         <w:rPr>
           <w:rFonts w:ascii="Calibri" w:hAnsi="Calibri"/>
-          <w:b/>
+          <w:b w:val="0"/>
           <w:i w:val="0"/>
+          <w:color w:val="3B2E2A"/>
           <w:sz w:val="22"/>
         </w:rPr>
         <w:t>O que é a Constelação Familiar?</w:t>
@@ -2436,7 +2396,7 @@
     </w:p>
     <w:p>
       <w:pPr>
-        <w:spacing w:before="0" w:after="120"/>
+        <w:spacing w:before="0" w:after="100"/>
         <w:jc w:val="left"/>
       </w:pPr>
       <w:r>
@@ -2444,6 +2404,7 @@
           <w:rFonts w:ascii="Calibri" w:hAnsi="Calibri"/>
           <w:b w:val="0"/>
           <w:i w:val="0"/>
+          <w:color w:val="3B2E2A"/>
           <w:sz w:val="22"/>
         </w:rPr>
         <w:t>É um método terapêutico criado por Bert Hellinger que revela as dinâmicas ocultas do seu sistema familiar. Em uma sessão, você consegue visualizar padrões que foram transmitidos de geração em geração e que influenciam as suas escolhas hoje, muitas vezes sem você perceber.</w:t>
@@ -2477,14 +2438,15 @@
     </w:p>
     <w:p>
       <w:pPr>
-        <w:spacing w:before="0" w:after="120"/>
+        <w:spacing w:before="0" w:after="100"/>
         <w:jc w:val="left"/>
       </w:pPr>
       <w:r>
         <w:rPr>
           <w:rFonts w:ascii="Calibri" w:hAnsi="Calibri"/>
-          <w:b/>
+          <w:b w:val="0"/>
           <w:i w:val="0"/>
+          <w:color w:val="3B2E2A"/>
           <w:sz w:val="22"/>
         </w:rPr>
         <w:t>O que a Constelação pode revelar</w:t>
@@ -2598,14 +2560,15 @@
     </w:p>
     <w:p>
       <w:pPr>
-        <w:spacing w:before="0" w:after="120"/>
+        <w:spacing w:before="0" w:after="100"/>
         <w:jc w:val="left"/>
       </w:pPr>
       <w:r>
         <w:rPr>
           <w:rFonts w:ascii="Calibri" w:hAnsi="Calibri"/>
-          <w:b/>
+          <w:b w:val="0"/>
           <w:i w:val="0"/>
+          <w:color w:val="3B2E2A"/>
           <w:sz w:val="22"/>
         </w:rPr>
         <w:t>Quem pode se beneficiar?</w:t>
@@ -2719,14 +2682,15 @@
     </w:p>
     <w:p>
       <w:pPr>
-        <w:spacing w:before="0" w:after="120"/>
+        <w:spacing w:before="0" w:after="100"/>
         <w:jc w:val="left"/>
       </w:pPr>
       <w:r>
         <w:rPr>
           <w:rFonts w:ascii="Calibri" w:hAnsi="Calibri"/>
-          <w:b/>
+          <w:b w:val="0"/>
           <w:i w:val="0"/>
+          <w:color w:val="3B2E2A"/>
           <w:sz w:val="22"/>
         </w:rPr>
         <w:t>Como funciona uma sessão?</w:t>
@@ -2734,7 +2698,7 @@
     </w:p>
     <w:p>
       <w:pPr>
-        <w:spacing w:before="0" w:after="120"/>
+        <w:spacing w:before="0" w:after="100"/>
         <w:jc w:val="left"/>
       </w:pPr>
       <w:r>
@@ -2742,6 +2706,7 @@
           <w:rFonts w:ascii="Calibri" w:hAnsi="Calibri"/>
           <w:b w:val="0"/>
           <w:i w:val="0"/>
+          <w:color w:val="3B2E2A"/>
           <w:sz w:val="22"/>
         </w:rPr>
         <w:t>A sessão pode ser individual ou em grupo. Você traz uma questão e, por meio de representações ou movimentos guiados pela terapeuta, o campo familiar se revela. Não é preciso saber exatamente o que buscar. O que precisa aparecer, aparece.</w:t>
@@ -2775,14 +2740,15 @@
     </w:p>
     <w:p>
       <w:pPr>
-        <w:spacing w:before="0" w:after="120"/>
+        <w:spacing w:before="0" w:after="100"/>
         <w:jc w:val="left"/>
       </w:pPr>
       <w:r>
         <w:rPr>
           <w:rFonts w:ascii="Calibri" w:hAnsi="Calibri"/>
-          <w:b/>
+          <w:b w:val="0"/>
           <w:i w:val="0"/>
+          <w:color w:val="3B2E2A"/>
           <w:sz w:val="22"/>
         </w:rPr>
         <w:t>O que as pessoas sentem depois</w:t>
@@ -2790,7 +2756,7 @@
     </w:p>
     <w:p>
       <w:pPr>
-        <w:spacing w:before="0" w:after="120"/>
+        <w:spacing w:before="0" w:after="100"/>
         <w:jc w:val="left"/>
       </w:pPr>
       <w:r>
@@ -2798,6 +2764,7 @@
           <w:rFonts w:ascii="Calibri" w:hAnsi="Calibri"/>
           <w:b w:val="0"/>
           <w:i w:val="0"/>
+          <w:color w:val="3B2E2A"/>
           <w:sz w:val="22"/>
         </w:rPr>
         <w:t>A maioria descreve a sensação de respirar fundo pela primeira vez. De entender sem precisar explicar. De se sentir menos pesada, mais inteira. Alguns chegam em uma sessão e voltam para resolver camadas diferentes. Cada processo é único.</w:t>
@@ -2826,7 +2793,7 @@
           <w:color w:val="3B2E2A"/>
           <w:sz w:val="18"/>
         </w:rPr>
-        <w:t>Prompt IA: Close-up of a woman's face, eyes gently closed, subtle peaceful smile, expression of relief. Soft natural light. Earthy warm tones: cream, lilac, terracotta. Photorealistic, square 1:1 format.</w:t>
+        <w:t>Prompt IA (em português): Close no rosto de uma mulher, olhos suavemente fechados, sorriso sutil e pacífico, expressão de alívio. Luz natural suave. Tons terrosos e quentes: creme, lilás, terracota. Fotorrealista, formato quadrado 1:1.</w:t>
       </w:r>
     </w:p>
     <w:p>
@@ -2852,19 +2819,20 @@
           <w:color w:val="3B2E2A"/>
           <w:sz w:val="18"/>
         </w:rPr>
-        <w:t xml:space="preserve">  CTA — Foto real do espaço</w:t>
+        <w:t xml:space="preserve">  CTA — Somente texto</w:t>
       </w:r>
     </w:p>
     <w:p>
       <w:pPr>
-        <w:spacing w:before="0" w:after="120"/>
+        <w:spacing w:before="0" w:after="100"/>
         <w:jc w:val="left"/>
       </w:pPr>
       <w:r>
         <w:rPr>
           <w:rFonts w:ascii="Calibri" w:hAnsi="Calibri"/>
-          <w:b/>
+          <w:b w:val="0"/>
           <w:i w:val="0"/>
+          <w:color w:val="3B2E2A"/>
           <w:sz w:val="22"/>
         </w:rPr>
         <w:t>Pronta e pronto para começar?</w:t>
@@ -2884,32 +2852,6 @@
           <w:sz w:val="22"/>
         </w:rPr>
         <w:t>Comente: CONSTELAÇÃO e nós vamos te enviar todas as informações sobre as próximas sessões disponíveis, tanto presenciais em Cuiabá quanto online, no seu direct.</w:t>
-      </w:r>
-    </w:p>
-    <w:p>
-      <w:pPr>
-        <w:spacing w:before="60" w:after="160"/>
-        <w:shd w:val="clear" w:color="auto" w:fill="FBF1EB"/>
-      </w:pPr>
-      <w:r>
-        <w:rPr>
-          <w:rFonts w:ascii="Calibri" w:hAnsi="Calibri"/>
-          <w:b/>
-          <w:i w:val="0"/>
-          <w:color w:val="C97B4A"/>
-          <w:sz w:val="16"/>
-        </w:rPr>
-        <w:t xml:space="preserve">IMAGEM: </w:t>
-      </w:r>
-      <w:r>
-        <w:rPr>
-          <w:rFonts w:ascii="Calibri" w:hAnsi="Calibri"/>
-          <w:b w:val="0"/>
-          <w:i/>
-          <w:color w:val="3B2E2A"/>
-          <w:sz w:val="18"/>
-        </w:rPr>
-        <w:t>Foto real do espaço de atendimento.</w:t>
       </w:r>
     </w:p>
     <w:p>
@@ -3284,7 +3226,7 @@
           <w:color w:val="3B2E2A"/>
           <w:sz w:val="18"/>
         </w:rPr>
-        <w:t>Priorizar foto real do espaço com cristais. Alternativa — Prompt IA: An arrangement of crystals on a wooden surface with dried herbs and flowers. Warm candlelight. Earthy tones: cream, lilac, sage green, terracotta. Photorealistic, square 1:1 format.</w:t>
+        <w:t>Priorizar foto real do espaço com cristais. Alternativa — Prompt IA (em português): Arranjo de cristais sobre uma superfície de madeira com ervas secas e flores. Luz de vela quente e natural. Tons terrosos: creme, lilás, verde sálvia, terracota. Fotorrealista, formato quadrado 1:1.</w:t>
       </w:r>
     </w:p>
     <w:p>
@@ -3659,7 +3601,7 @@
           <w:color w:val="3B2E2A"/>
           <w:sz w:val="18"/>
         </w:rPr>
-        <w:t>Prompt IA: A woman near a river or under tall trees, eyes closed in meditation, surrounded by subtle natural elements (fire, water, earth, air). Sacred, mystical atmosphere. Earthy tones: terracotta, cream, sage green. Photorealistic, cinematic, square 1:1 format.</w:t>
+        <w:t>Prompt IA (em português): Mulher próxima a um rio ou sob árvores altas, olhos fechados em meditação, rodeada por elementos sutis da natureza representando fogo, água, terra e ar. Atmosfera sagrada e mística. Tons terrosos: terracota, creme, verde sálvia. Fotorrealista, cinemático, formato quadrado 1:1.</w:t>
       </w:r>
     </w:p>
     <w:p>
@@ -4012,7 +3954,7 @@
           <w:color w:val="3B2E2A"/>
           <w:sz w:val="18"/>
         </w:rPr>
-        <w:t>Prompt IA: Two women sitting across from each other in a warm, intimate therapy room. One listening attentively with compassion, the other speaking softly. Soft natural light, plants in background. Earthy tones: cream, lilac, sage green. Photorealistic, cinematic, square 1:1 format.</w:t>
+        <w:t>Prompt IA (em português): Duas mulheres sentadas uma de frente para a outra em uma sala de terapia acolhedora e íntima. Uma escutando com atenção e compaixão, a outra falando suavemente. Luz natural suave, plantas ao fundo. Tons terrosos: creme, lilás, verde sálvia. Fotorrealista, cinemático, formato quadrado 1:1.</w:t>
       </w:r>
     </w:p>
     <w:p>

</xml_diff>